<commit_message>
Alterações: Atualização de documentação
</commit_message>
<xml_diff>
--- a/Documentação Técnica.docx
+++ b/Documentação Técnica.docx
@@ -64,6 +64,67 @@
       <w:r>
         <w:t xml:space="preserve"> simples, separando a responsabilidade de coleta da responsabilidade de entrega dos dados.</w:t>
       </w:r>
+    </w:p>
+    <w:p>
+      <w:pPr>
+        <w:pStyle w:val="NormalWeb"/>
+      </w:pPr>
+      <w:r>
+        <w:t xml:space="preserve">O </w:t>
+      </w:r>
+      <w:r>
+        <w:t xml:space="preserve">Projeto de captura dados </w:t>
+      </w:r>
+      <w:r>
+        <w:t xml:space="preserve">econômicos no site da </w:t>
+      </w:r>
+      <w:proofErr w:type="spellStart"/>
+      <w:r>
+        <w:t>Uol</w:t>
+      </w:r>
+      <w:proofErr w:type="spellEnd"/>
+      <w:r>
+        <w:t xml:space="preserve"> (</w:t>
+      </w:r>
+      <w:hyperlink r:id="rId5" w:history="1">
+        <w:r>
+          <w:rPr>
+            <w:rStyle w:val="Hyperlink"/>
+            <w:rFonts w:ascii="Cascadia Mono" w:hAnsi="Cascadia Mono" w:cs="Cascadia Mono"/>
+            <w:sz w:val="19"/>
+            <w:szCs w:val="19"/>
+            <w:highlight w:val="white"/>
+          </w:rPr>
+          <w:t>https://economia.uol.com.br/cotacoes/</w:t>
+        </w:r>
+      </w:hyperlink>
+      <w:r>
+        <w:t xml:space="preserve">), </w:t>
+      </w:r>
+      <w:r>
+        <w:t>para avaliar valores de moedas internacionais</w:t>
+      </w:r>
+      <w:r>
+        <w:t xml:space="preserve">, utilizando o </w:t>
+      </w:r>
+      <w:proofErr w:type="spellStart"/>
+      <w:r>
+        <w:t>worker</w:t>
+      </w:r>
+      <w:proofErr w:type="spellEnd"/>
+      <w:r>
+        <w:t xml:space="preserve"> para executar essa captura automática, diretamente no site e disponibilizando um </w:t>
+      </w:r>
+      <w:proofErr w:type="spellStart"/>
+      <w:r>
+        <w:t>end</w:t>
+      </w:r>
+      <w:proofErr w:type="spellEnd"/>
+      <w:r>
+        <w:t>-point para leitura desses dados(API)</w:t>
+      </w:r>
+      <w:bookmarkStart w:id="0" w:name="_GoBack"/>
+      <w:bookmarkEnd w:id="0"/>
     </w:p>
     <w:p>
       <w:r>
@@ -514,6 +575,7 @@
           <w:b/>
           <w:bCs/>
         </w:rPr>
+        <w:lastRenderedPageBreak/>
         <w:t>Caminho no Container:</w:t>
       </w:r>
       <w:r>
@@ -602,7 +664,6 @@
     </w:p>
     <w:p>
       <w:r>
-        <w:lastRenderedPageBreak/>
         <w:pict>
           <v:rect id="_x0000_i1028" style="width:0;height:1.5pt" o:hralign="center" o:hrstd="t" o:hr="t" fillcolor="#a0a0a0" stroked="f"/>
         </w:pict>
@@ -1330,6 +1391,7 @@
         <w:pStyle w:val="Ttulo3"/>
       </w:pPr>
       <w:r>
+        <w:lastRenderedPageBreak/>
         <w:t>8. Próximos Passos Sugeridos</w:t>
       </w:r>
     </w:p>
@@ -1453,7 +1515,6 @@
           <w:b/>
           <w:bCs/>
         </w:rPr>
-        <w:lastRenderedPageBreak/>
         <w:t>Dashboard</w:t>
       </w:r>
       <w:proofErr w:type="spellEnd"/>
@@ -1484,10 +1545,7 @@
         <w:t xml:space="preserve"> para exibir esses dados em gráficos.</w:t>
       </w:r>
     </w:p>
-    <w:p>
-      <w:bookmarkStart w:id="0" w:name="_GoBack"/>
-      <w:bookmarkEnd w:id="0"/>
-    </w:p>
+    <w:p/>
     <w:sectPr>
       <w:pgSz w:w="11906" w:h="16838"/>
       <w:pgMar w:top="1417" w:right="1701" w:bottom="1417" w:left="1701" w:header="708" w:footer="708" w:gutter="0"/>
@@ -3486,6 +3544,17 @@
     <w:basedOn w:val="Fontepargpadro"/>
     <w:rsid w:val="00FA69AF"/>
   </w:style>
+  <w:style w:type="character" w:styleId="Hyperlink">
+    <w:name w:val="Hyperlink"/>
+    <w:basedOn w:val="Fontepargpadro"/>
+    <w:uiPriority w:val="99"/>
+    <w:unhideWhenUsed/>
+    <w:rsid w:val="00364043"/>
+    <w:rPr>
+      <w:color w:val="0563C1" w:themeColor="hyperlink"/>
+      <w:u w:val="single"/>
+    </w:rPr>
+  </w:style>
 </w:styles>
 </file>
 

</xml_diff>